<commit_message>
fix bugs: timer, init. + screenshot in report
</commit_message>
<xml_diff>
--- a/MokoWordExample.docx
+++ b/MokoWordExample.docx
@@ -622,15 +622,13 @@
           <w:rFonts w:ascii="Times New Roman" w:hAnsi="Times New Roman" w:cs="Times New Roman"/>
           <w:sz w:val="28"/>
           <w:szCs w:val="28"/>
-          <w:lang w:val="en-US"/>
-        </w:rPr>
-      </w:pPr>
-      <w:r>
-        <w:rPr>
-          <w:rFonts w:ascii="Times New Roman" w:hAnsi="Times New Roman" w:cs="Times New Roman"/>
-          <w:sz w:val="28"/>
-          <w:szCs w:val="28"/>
-          <w:lang w:val="en-US"/>
+        </w:rPr>
+      </w:pPr>
+      <w:r>
+        <w:rPr>
+          <w:rFonts w:ascii="Times New Roman" w:hAnsi="Times New Roman" w:cs="Times New Roman"/>
+          <w:sz w:val="28"/>
+          <w:szCs w:val="28"/>
         </w:rPr>
         <w:t xml:space="preserve">         </w:t>
       </w:r>
@@ -648,7 +646,6 @@
           <w:rFonts w:ascii="Times New Roman" w:hAnsi="Times New Roman" w:cs="Times New Roman"/>
           <w:sz w:val="28"/>
           <w:szCs w:val="28"/>
-          <w:lang w:val="en-US"/>
         </w:rPr>
         <w:t xml:space="preserve"> №4. </w:t>
       </w:r>
@@ -665,7 +662,6 @@
           <w:rFonts w:ascii="Times New Roman" w:hAnsi="Times New Roman" w:cs="Times New Roman"/>
           <w:sz w:val="28"/>
           <w:szCs w:val="28"/>
-          <w:lang w:val="en-US"/>
         </w:rPr>
         <w:t xml:space="preserve"> </w:t>
       </w:r>
@@ -682,7 +678,6 @@
           <w:rFonts w:ascii="Times New Roman" w:hAnsi="Times New Roman" w:cs="Times New Roman"/>
           <w:sz w:val="28"/>
           <w:szCs w:val="28"/>
-          <w:lang w:val="en-US"/>
         </w:rPr>
         <w:t xml:space="preserve">: </w:t>
       </w:r>
@@ -704,7 +699,6 @@
           <w:rFonts w:ascii="Times New Roman" w:hAnsi="Times New Roman" w:cs="Times New Roman"/>
           <w:sz w:val="28"/>
           <w:szCs w:val="28"/>
-          <w:lang w:val="en-US"/>
         </w:rPr>
         <w:t xml:space="preserve">         </w:t>
       </w:r>
@@ -1220,6 +1214,37 @@
       </w:r>
       <w:bookmarkStart w:id="11" w:name="explugin_3"/>
       <w:bookmarkEnd w:id="11"/>
+    </w:p>
+    <w:p>
+      <w:pPr>
+        <w:rPr>
+          <w:rFonts w:ascii="Times New Roman" w:hAnsi="Times New Roman" w:cs="Times New Roman"/>
+          <w:sz w:val="28"/>
+          <w:szCs w:val="28"/>
+          <w:lang w:val="en-US"/>
+        </w:rPr>
+      </w:pPr>
+    </w:p>
+    <w:p>
+      <w:pPr>
+        <w:rPr>
+          <w:rFonts w:ascii="Times New Roman" w:hAnsi="Times New Roman" w:cs="Times New Roman"/>
+          <w:sz w:val="28"/>
+          <w:szCs w:val="28"/>
+          <w:lang w:val="en-US"/>
+        </w:rPr>
+      </w:pPr>
+      <w:r>
+        <w:rPr>
+          <w:rFonts w:ascii="Times New Roman" w:hAnsi="Times New Roman" w:cs="Times New Roman"/>
+          <w:sz w:val="28"/>
+          <w:szCs w:val="28"/>
+          <w:lang w:val="en-US"/>
+        </w:rPr>
+        <w:t xml:space="preserve">Screenshot: </w:t>
+      </w:r>
+      <w:bookmarkStart w:id="12" w:name="explugin_2"/>
+      <w:bookmarkEnd w:id="12"/>
     </w:p>
     <w:sectPr>
       <w:headerReference w:type="default" r:id="rId7"/>

</xml_diff>